<commit_message>
fix: correct experience order to reverse chronological
Experience section now follows standard CV format (most recent first):
1. Embafinans (2025 - Present)
2. Kapital Bank (2024 - 2025)
3. Umico (2022 - 2024)
4. State Employment Agency / LMAS (2021 - 2022)
5. Central Bank / GPP (2007 - 2012)
</commit_message>
<xml_diff>
--- a/Zamir_Jamalov_CV_Innovation_Agency_EN.docx
+++ b/Zamir_Jamalov_CV_Innovation_Agency_EN.docx
@@ -263,106 +263,6 @@
           <w:color w:val="212529"/>
           <w:sz w:val="18"/>
         </w:rPr>
-        <w:t>State Employment Agency  |  Innovation Department Lead &amp; Business Analyst</w:t>
-      </w:r>
-    </w:p>
-    <w:p>
-      <w:pPr>
-        <w:spacing w:after="40" w:before="0" w:line="260" w:lineRule="exact"/>
-        <w:jc w:val="left"/>
-      </w:pPr>
-      <w:r>
-        <w:rPr>
-          <w:rFonts w:ascii="Calibri" w:hAnsi="Calibri"/>
-          <w:b w:val="0"/>
-          <w:color w:val="787878"/>
-          <w:sz w:val="16"/>
-        </w:rPr>
-        <w:t>2021 - 2022</w:t>
-      </w:r>
-    </w:p>
-    <w:p>
-      <w:pPr>
-        <w:spacing w:after="30" w:before="0" w:line="250" w:lineRule="exact"/>
-        <w:ind w:left="360" w:hanging="216"/>
-      </w:pPr>
-      <w:r>
-        <w:rPr>
-          <w:rFonts w:ascii="Calibri" w:hAnsi="Calibri"/>
-          <w:color w:val="212529"/>
-          <w:sz w:val="18"/>
-        </w:rPr>
-        <w:t>Led the digitization of the Labour and Employment Subsystem (LMAS): analyzed the full citizen service journey from application to result, designed the end-to-end process architecture, and authored requirements documentation for the initial system development</w:t>
-      </w:r>
-    </w:p>
-    <w:p>
-      <w:pPr>
-        <w:spacing w:after="30" w:before="0" w:line="250" w:lineRule="exact"/>
-        <w:ind w:left="360" w:hanging="216"/>
-      </w:pPr>
-      <w:r>
-        <w:rPr>
-          <w:rFonts w:ascii="Calibri" w:hAnsi="Calibri"/>
-          <w:color w:val="212529"/>
-          <w:sz w:val="18"/>
-        </w:rPr>
-        <w:t>Designed a new citizen service channel using Telegram bot for real-time application submission and response processing, reducing the need for physical office visits and improving service accessibility</w:t>
-      </w:r>
-    </w:p>
-    <w:p>
-      <w:pPr>
-        <w:spacing w:after="30" w:before="0" w:line="250" w:lineRule="exact"/>
-        <w:ind w:left="360" w:hanging="216"/>
-      </w:pPr>
-      <w:r>
-        <w:rPr>
-          <w:rFonts w:ascii="Calibri" w:hAnsi="Calibri"/>
-          <w:color w:val="212529"/>
-          <w:sz w:val="18"/>
-        </w:rPr>
-        <w:t>Built a real-time service performance monitoring dashboard for the management board, tracking citizen applications, response times (SLA), and service quality indicators (KPI)</w:t>
-      </w:r>
-    </w:p>
-    <w:p>
-      <w:pPr>
-        <w:spacing w:after="30" w:before="0" w:line="250" w:lineRule="exact"/>
-        <w:ind w:left="360" w:hanging="216"/>
-      </w:pPr>
-      <w:r>
-        <w:rPr>
-          <w:rFonts w:ascii="Calibri" w:hAnsi="Calibri"/>
-          <w:color w:val="212529"/>
-          <w:sz w:val="18"/>
-        </w:rPr>
-        <w:t>Coordinated a 15-member cross-functional project team, provided methodology guidance, and managed multi-stakeholder communication across government departments</w:t>
-      </w:r>
-    </w:p>
-    <w:p>
-      <w:pPr>
-        <w:spacing w:after="30" w:before="0" w:line="250" w:lineRule="exact"/>
-        <w:ind w:left="360" w:hanging="216"/>
-      </w:pPr>
-      <w:r>
-        <w:rPr>
-          <w:rFonts w:ascii="Calibri" w:hAnsi="Calibri"/>
-          <w:color w:val="212529"/>
-          <w:sz w:val="18"/>
-        </w:rPr>
-        <w:t>Conducted stakeholder interviews and service gap analysis to identify pain points in the existing employment service delivery process</w:t>
-      </w:r>
-    </w:p>
-    <w:p>
-      <w:pPr>
-        <w:spacing w:after="20" w:before="80" w:line="260" w:lineRule="exact"/>
-        <w:jc w:val="left"/>
-      </w:pPr>
-      <w:r>
-        <w:rPr>
-          <w:rFonts w:ascii="Calibri" w:hAnsi="Calibri"/>
-          <w:b/>
-          <w:color w:val="212529"/>
-          <w:sz w:val="18"/>
-        </w:rPr>
         <w:t>Embafinans  |  Lead IT Business Analyst</w:t>
       </w:r>
     </w:p>
@@ -551,6 +451,106 @@
           <w:sz w:val="18"/>
         </w:rPr>
         <w:t>Developed backend features using PostgreSQL, resolved L2 production incidents, and supported partner development teams</w:t>
+      </w:r>
+    </w:p>
+    <w:p>
+      <w:pPr>
+        <w:spacing w:after="20" w:before="80" w:line="260" w:lineRule="exact"/>
+        <w:jc w:val="left"/>
+      </w:pPr>
+      <w:r>
+        <w:rPr>
+          <w:rFonts w:ascii="Calibri" w:hAnsi="Calibri"/>
+          <w:b/>
+          <w:color w:val="212529"/>
+          <w:sz w:val="18"/>
+        </w:rPr>
+        <w:t>State Employment Agency  |  Innovation Department Lead &amp; Business Analyst</w:t>
+      </w:r>
+    </w:p>
+    <w:p>
+      <w:pPr>
+        <w:spacing w:after="40" w:before="0" w:line="260" w:lineRule="exact"/>
+        <w:jc w:val="left"/>
+      </w:pPr>
+      <w:r>
+        <w:rPr>
+          <w:rFonts w:ascii="Calibri" w:hAnsi="Calibri"/>
+          <w:b w:val="0"/>
+          <w:color w:val="787878"/>
+          <w:sz w:val="16"/>
+        </w:rPr>
+        <w:t>2021 - 2022</w:t>
+      </w:r>
+    </w:p>
+    <w:p>
+      <w:pPr>
+        <w:spacing w:after="30" w:before="0" w:line="250" w:lineRule="exact"/>
+        <w:ind w:left="360" w:hanging="216"/>
+      </w:pPr>
+      <w:r>
+        <w:rPr>
+          <w:rFonts w:ascii="Calibri" w:hAnsi="Calibri"/>
+          <w:color w:val="212529"/>
+          <w:sz w:val="18"/>
+        </w:rPr>
+        <w:t>Led the digitization of the Labour and Employment Subsystem (LMAS): analyzed the full citizen service journey from application to result, designed the end-to-end process architecture, and authored requirements documentation for the initial system development</w:t>
+      </w:r>
+    </w:p>
+    <w:p>
+      <w:pPr>
+        <w:spacing w:after="30" w:before="0" w:line="250" w:lineRule="exact"/>
+        <w:ind w:left="360" w:hanging="216"/>
+      </w:pPr>
+      <w:r>
+        <w:rPr>
+          <w:rFonts w:ascii="Calibri" w:hAnsi="Calibri"/>
+          <w:color w:val="212529"/>
+          <w:sz w:val="18"/>
+        </w:rPr>
+        <w:t>Designed a new citizen service channel using Telegram bot for real-time application submission and response processing, reducing the need for physical office visits and improving service accessibility</w:t>
+      </w:r>
+    </w:p>
+    <w:p>
+      <w:pPr>
+        <w:spacing w:after="30" w:before="0" w:line="250" w:lineRule="exact"/>
+        <w:ind w:left="360" w:hanging="216"/>
+      </w:pPr>
+      <w:r>
+        <w:rPr>
+          <w:rFonts w:ascii="Calibri" w:hAnsi="Calibri"/>
+          <w:color w:val="212529"/>
+          <w:sz w:val="18"/>
+        </w:rPr>
+        <w:t>Built a real-time service performance monitoring dashboard for the management board, tracking citizen applications, response times (SLA), and service quality indicators (KPI)</w:t>
+      </w:r>
+    </w:p>
+    <w:p>
+      <w:pPr>
+        <w:spacing w:after="30" w:before="0" w:line="250" w:lineRule="exact"/>
+        <w:ind w:left="360" w:hanging="216"/>
+      </w:pPr>
+      <w:r>
+        <w:rPr>
+          <w:rFonts w:ascii="Calibri" w:hAnsi="Calibri"/>
+          <w:color w:val="212529"/>
+          <w:sz w:val="18"/>
+        </w:rPr>
+        <w:t>Coordinated a 15-member cross-functional project team, provided methodology guidance, and managed multi-stakeholder communication across government departments</w:t>
+      </w:r>
+    </w:p>
+    <w:p>
+      <w:pPr>
+        <w:spacing w:after="30" w:before="0" w:line="250" w:lineRule="exact"/>
+        <w:ind w:left="360" w:hanging="216"/>
+      </w:pPr>
+      <w:r>
+        <w:rPr>
+          <w:rFonts w:ascii="Calibri" w:hAnsi="Calibri"/>
+          <w:color w:val="212529"/>
+          <w:sz w:val="18"/>
+        </w:rPr>
+        <w:t>Conducted stakeholder interviews and service gap analysis to identify pain points in the existing employment service delivery process</w:t>
       </w:r>
     </w:p>
     <w:p>

</xml_diff>

<commit_message>
fix: correct employment dates and add missing entries
Timeline corrections:
- Added Rabita Bank (2018-2019) as Software Developer
- Added Umico Backend Developer (2019-2021) - separate from Integration role
- DMA: changed Department Lead to Section Lead (sobə rəhbəri)
- Reduced Embafinans bullets from 4 to 3 (space optimization)
- Updated Additional Background to remove entries now shown separately

Full reverse chronological order:
1. Embafinans (2025 - Present)
2. Kapital Bank (2024 - 2025)
3. Umico Integration Specialist (2022 - 2024)
4. State Employment Agency / LMAS (2021 - 2022)
5. Umico Backend Developer (2019 - 2021)
6. Rabita Bank (2018 - 2019)
7. Central Bank / GPP (2007 - 2012)
</commit_message>
<xml_diff>
--- a/Zamir_Jamalov_CV_Innovation_Agency_EN.docx
+++ b/Zamir_Jamalov_CV_Innovation_Agency_EN.docx
@@ -320,21 +320,7 @@
           <w:color w:val="212529"/>
           <w:sz w:val="18"/>
         </w:rPr>
-        <w:t>Defining REST API specifications in Swagger / OpenAPI 3.0 and creating sequence diagrams for integration flows</w:t>
-      </w:r>
-    </w:p>
-    <w:p>
-      <w:pPr>
-        <w:spacing w:after="30" w:before="0" w:line="250" w:lineRule="exact"/>
-        <w:ind w:left="360" w:hanging="216"/>
-      </w:pPr>
-      <w:r>
-        <w:rPr>
-          <w:rFonts w:ascii="Calibri" w:hAnsi="Calibri"/>
-          <w:color w:val="212529"/>
-          <w:sz w:val="18"/>
-        </w:rPr>
-        <w:t>Coordinating UAT execution with business stakeholders, leading bug triage meetings, and achieving on-time sign-off across release cycles</w:t>
+        <w:t>Defining REST API specifications in Swagger / OpenAPI 3.0 and coordinating UAT execution with business stakeholders</w:t>
       </w:r>
     </w:p>
     <w:p>
@@ -465,7 +451,7 @@
           <w:color w:val="212529"/>
           <w:sz w:val="18"/>
         </w:rPr>
-        <w:t>State Employment Agency  |  Innovation Department Lead &amp; Business Analyst</w:t>
+        <w:t>State Employment Agency  |  Innovation Section Lead &amp; Business Analyst</w:t>
       </w:r>
     </w:p>
     <w:p>
@@ -494,7 +480,7 @@
           <w:color w:val="212529"/>
           <w:sz w:val="18"/>
         </w:rPr>
-        <w:t>Led the digitization of the Labour and Employment Subsystem (LMAS): analyzed the full citizen service journey from application to result, designed the end-to-end process architecture, and authored requirements documentation for the initial system development</w:t>
+        <w:t>Led the digitization of the Labour and Employment Subsystem (LMAS): analyzed the full citizen service journey from application to result, designed the end-to-end process architecture, and authored requirements documentation</w:t>
       </w:r>
     </w:p>
     <w:p>
@@ -508,7 +494,7 @@
           <w:color w:val="212529"/>
           <w:sz w:val="18"/>
         </w:rPr>
-        <w:t>Designed a new citizen service channel using Telegram bot for real-time application submission and response processing, reducing the need for physical office visits and improving service accessibility</w:t>
+        <w:t>Designed a citizen service channel using Telegram bot for real-time application submission, reducing physical office visits and improving accessibility</w:t>
       </w:r>
     </w:p>
     <w:p>
@@ -522,7 +508,7 @@
           <w:color w:val="212529"/>
           <w:sz w:val="18"/>
         </w:rPr>
-        <w:t>Built a real-time service performance monitoring dashboard for the management board, tracking citizen applications, response times (SLA), and service quality indicators (KPI)</w:t>
+        <w:t>Built a real-time monitoring dashboard tracking citizen applications, response times (SLA), and service quality indicators (KPI)</w:t>
       </w:r>
     </w:p>
     <w:p>
@@ -536,7 +522,37 @@
           <w:color w:val="212529"/>
           <w:sz w:val="18"/>
         </w:rPr>
-        <w:t>Coordinated a 15-member cross-functional project team, provided methodology guidance, and managed multi-stakeholder communication across government departments</w:t>
+        <w:t>Coordinated a 15-member cross-functional project team and managed multi-stakeholder communication across government departments</w:t>
+      </w:r>
+    </w:p>
+    <w:p>
+      <w:pPr>
+        <w:spacing w:after="20" w:before="80" w:line="260" w:lineRule="exact"/>
+        <w:jc w:val="left"/>
+      </w:pPr>
+      <w:r>
+        <w:rPr>
+          <w:rFonts w:ascii="Calibri" w:hAnsi="Calibri"/>
+          <w:b/>
+          <w:color w:val="212529"/>
+          <w:sz w:val="18"/>
+        </w:rPr>
+        <w:t>Umico  |  Backend Developer</w:t>
+      </w:r>
+    </w:p>
+    <w:p>
+      <w:pPr>
+        <w:spacing w:after="40" w:before="0" w:line="260" w:lineRule="exact"/>
+        <w:jc w:val="left"/>
+      </w:pPr>
+      <w:r>
+        <w:rPr>
+          <w:rFonts w:ascii="Calibri" w:hAnsi="Calibri"/>
+          <w:b w:val="0"/>
+          <w:color w:val="787878"/>
+          <w:sz w:val="16"/>
+        </w:rPr>
+        <w:t>2019 - 2021</w:t>
       </w:r>
     </w:p>
     <w:p>
@@ -550,7 +566,51 @@
           <w:color w:val="212529"/>
           <w:sz w:val="18"/>
         </w:rPr>
-        <w:t>Conducted stakeholder interviews and service gap analysis to identify pain points in the existing employment service delivery process</w:t>
+        <w:t>Developed backend services and API endpoints using PostgreSQL; participated in cross-functional feature development and production support</w:t>
+      </w:r>
+    </w:p>
+    <w:p>
+      <w:pPr>
+        <w:spacing w:after="20" w:before="80" w:line="260" w:lineRule="exact"/>
+        <w:jc w:val="left"/>
+      </w:pPr>
+      <w:r>
+        <w:rPr>
+          <w:rFonts w:ascii="Calibri" w:hAnsi="Calibri"/>
+          <w:b/>
+          <w:color w:val="212529"/>
+          <w:sz w:val="18"/>
+        </w:rPr>
+        <w:t>Rabita Bank  |  Software Developer</w:t>
+      </w:r>
+    </w:p>
+    <w:p>
+      <w:pPr>
+        <w:spacing w:after="40" w:before="0" w:line="260" w:lineRule="exact"/>
+        <w:jc w:val="left"/>
+      </w:pPr>
+      <w:r>
+        <w:rPr>
+          <w:rFonts w:ascii="Calibri" w:hAnsi="Calibri"/>
+          <w:b w:val="0"/>
+          <w:color w:val="787878"/>
+          <w:sz w:val="16"/>
+        </w:rPr>
+        <w:t>2018 - 2019</w:t>
+      </w:r>
+    </w:p>
+    <w:p>
+      <w:pPr>
+        <w:spacing w:after="30" w:before="0" w:line="250" w:lineRule="exact"/>
+        <w:ind w:left="360" w:hanging="216"/>
+      </w:pPr>
+      <w:r>
+        <w:rPr>
+          <w:rFonts w:ascii="Calibri" w:hAnsi="Calibri"/>
+          <w:color w:val="212529"/>
+          <w:sz w:val="18"/>
+        </w:rPr>
+        <w:t>Core banking system development and maintenance; participated in software requirements analysis and system integration tasks</w:t>
       </w:r>
     </w:p>
     <w:p>
@@ -684,7 +744,7 @@
           <w:color w:val="212529"/>
           <w:sz w:val="17"/>
         </w:rPr>
-        <w:t>10+ years of software engineering and data analytics experience across Azerbaijan's banking and public sectors, including core banking development (Zaminbank, Unibank, Bank of Baku, Rabita Bank), backend development (Umico), and public services (ASAN Service). This foundation provides deep understanding of enterprise systems, database architectures (Oracle, MSSQL, PostgreSQL, MongoDB), government service delivery patterns, and cross-organization integration.</w:t>
+        <w:t>Additional software engineering and data analytics experience across Azerbaijan's banking and public sectors, including core banking development (Zaminbank, Unibank, Bank of Baku) and public services (ASAN Service). This foundation provides deep understanding of enterprise systems, database architectures (Oracle, MSSQL, PostgreSQL, MongoDB), and government service delivery patterns.</w:t>
       </w:r>
     </w:p>
     <w:p>

</xml_diff>

<commit_message>
refactor: revert to 5-entry format, move Rabita Bank + Umico Backend to Additional Background
5 full entries (reverse chronological):
1. Embafinans (2025 - Present)
2. Kapital Bank (2024 - 2025)
3. Umico Integration (2022 - 2024)
4. State Employment Agency / LMAS (2021 - 2022)
5. Central Bank / GPP (2007 - 2012)

Additional Background: Rabita Bank (2018-2019), Umico Backend (2019-2021),
Zaminbank, Unibank, Bank of Baku, ASAN Service
</commit_message>
<xml_diff>
--- a/Zamir_Jamalov_CV_Innovation_Agency_EN.docx
+++ b/Zamir_Jamalov_CV_Innovation_Agency_EN.docx
@@ -537,94 +537,6 @@
           <w:color w:val="212529"/>
           <w:sz w:val="18"/>
         </w:rPr>
-        <w:t>Umico  |  Backend Developer</w:t>
-      </w:r>
-    </w:p>
-    <w:p>
-      <w:pPr>
-        <w:spacing w:after="40" w:before="0" w:line="260" w:lineRule="exact"/>
-        <w:jc w:val="left"/>
-      </w:pPr>
-      <w:r>
-        <w:rPr>
-          <w:rFonts w:ascii="Calibri" w:hAnsi="Calibri"/>
-          <w:b w:val="0"/>
-          <w:color w:val="787878"/>
-          <w:sz w:val="16"/>
-        </w:rPr>
-        <w:t>2019 - 2021</w:t>
-      </w:r>
-    </w:p>
-    <w:p>
-      <w:pPr>
-        <w:spacing w:after="30" w:before="0" w:line="250" w:lineRule="exact"/>
-        <w:ind w:left="360" w:hanging="216"/>
-      </w:pPr>
-      <w:r>
-        <w:rPr>
-          <w:rFonts w:ascii="Calibri" w:hAnsi="Calibri"/>
-          <w:color w:val="212529"/>
-          <w:sz w:val="18"/>
-        </w:rPr>
-        <w:t>Developed backend services and API endpoints using PostgreSQL; participated in cross-functional feature development and production support</w:t>
-      </w:r>
-    </w:p>
-    <w:p>
-      <w:pPr>
-        <w:spacing w:after="20" w:before="80" w:line="260" w:lineRule="exact"/>
-        <w:jc w:val="left"/>
-      </w:pPr>
-      <w:r>
-        <w:rPr>
-          <w:rFonts w:ascii="Calibri" w:hAnsi="Calibri"/>
-          <w:b/>
-          <w:color w:val="212529"/>
-          <w:sz w:val="18"/>
-        </w:rPr>
-        <w:t>Rabita Bank  |  Software Developer</w:t>
-      </w:r>
-    </w:p>
-    <w:p>
-      <w:pPr>
-        <w:spacing w:after="40" w:before="0" w:line="260" w:lineRule="exact"/>
-        <w:jc w:val="left"/>
-      </w:pPr>
-      <w:r>
-        <w:rPr>
-          <w:rFonts w:ascii="Calibri" w:hAnsi="Calibri"/>
-          <w:b w:val="0"/>
-          <w:color w:val="787878"/>
-          <w:sz w:val="16"/>
-        </w:rPr>
-        <w:t>2018 - 2019</w:t>
-      </w:r>
-    </w:p>
-    <w:p>
-      <w:pPr>
-        <w:spacing w:after="30" w:before="0" w:line="250" w:lineRule="exact"/>
-        <w:ind w:left="360" w:hanging="216"/>
-      </w:pPr>
-      <w:r>
-        <w:rPr>
-          <w:rFonts w:ascii="Calibri" w:hAnsi="Calibri"/>
-          <w:color w:val="212529"/>
-          <w:sz w:val="18"/>
-        </w:rPr>
-        <w:t>Core banking system development and maintenance; participated in software requirements analysis and system integration tasks</w:t>
-      </w:r>
-    </w:p>
-    <w:p>
-      <w:pPr>
-        <w:spacing w:after="20" w:before="80" w:line="260" w:lineRule="exact"/>
-        <w:jc w:val="left"/>
-      </w:pPr>
-      <w:r>
-        <w:rPr>
-          <w:rFonts w:ascii="Calibri" w:hAnsi="Calibri"/>
-          <w:b/>
-          <w:color w:val="212529"/>
-          <w:sz w:val="18"/>
-        </w:rPr>
         <w:t>Central Bank of Azerbaijan  |  Integration Specialist</w:t>
       </w:r>
     </w:p>
@@ -744,7 +656,7 @@
           <w:color w:val="212529"/>
           <w:sz w:val="17"/>
         </w:rPr>
-        <w:t>Additional software engineering and data analytics experience across Azerbaijan's banking and public sectors, including core banking development (Zaminbank, Unibank, Bank of Baku) and public services (ASAN Service). This foundation provides deep understanding of enterprise systems, database architectures (Oracle, MSSQL, PostgreSQL, MongoDB), and government service delivery patterns.</w:t>
+        <w:t>Software engineering and data analytics experience (2018-2021) at Rabita Bank and Umico in backend development and system integration; prior roles at Zaminbank, Unibank, Bank of Baku, and ASAN Service. This foundation provides deep understanding of enterprise systems, database architectures (Oracle, MSSQL, PostgreSQL, MongoDB), and government service delivery patterns.</w:t>
       </w:r>
     </w:p>
     <w:p>

</xml_diff>

<commit_message>
CV v4: cleaned summary - removed company names and '14+ production-level', softened Professional Development
</commit_message>
<xml_diff>
--- a/Zamir_Jamalov_CV_Innovation_Agency_EN.docx
+++ b/Zamir_Jamalov_CV_Innovation_Agency_EN.docx
@@ -82,7 +82,7 @@
           <w:color w:val="212529"/>
           <w:sz w:val="17"/>
         </w:rPr>
-        <w:t>Business Analyst with experience in government service digitization, multi-agency coordination and end-to-end process design. 18 years in IT, including key government projects: the Government Payment Portal (GPP) at the Central Bank and the Labour and Employment Subsystem (LMAS) at the State Employment Agency. Practical experience in service journey analysis, citizen-centered digital channel design, and coordination across multiple government organizations. Author of 14+ production-level BA documents (BRD, FRD, SRS, User Stories, API Specifications) across fintech, e-commerce and government services.</w:t>
+        <w:t>Business Analyst with 18 years in IT, specializing in government service digitization, multi-agency coordination, and end-to-end process design. Practical experience in service journey analysis, citizen-centered digital service design, and requirements documentation (BRD, FRD, SRS, API Specifications). Strong background in aligning cross-functional teams across government organizations to deliver digital public services.</w:t>
       </w:r>
     </w:p>
     <w:p>
@@ -618,7 +618,7 @@
           <w:color w:val="212529"/>
           <w:sz w:val="17"/>
         </w:rPr>
-        <w:t>Acquired business analysis methodology through practical application in real projects: 14+ production-level BA documents (BRD, FRD, SRS, User Stories, API Specifications, BPMN, UAT) across fintech, e-commerce and government services. Practical experience in both business process and service design methodologies.</w:t>
+        <w:t>Acquired business analysis methodology through practical application across fintech, e-commerce and government digitization projects. Produced BA documentation including BRD, FRD, SRS, User Stories, API Specifications, BPMN process models and UAT plans in real production environments.</w:t>
       </w:r>
     </w:p>
     <w:p>

</xml_diff>

<commit_message>
CV v5: added keywords - life-event, single-window, methodology - to match vacancy requirements
</commit_message>
<xml_diff>
--- a/Zamir_Jamalov_CV_Innovation_Agency_EN.docx
+++ b/Zamir_Jamalov_CV_Innovation_Agency_EN.docx
@@ -480,7 +480,7 @@
           <w:color w:val="212529"/>
           <w:sz w:val="18"/>
         </w:rPr>
-        <w:t>Led the digitization of the Labour and Employment Subsystem (LMAS): analyzed the full citizen service journey from application to result, designed the end-to-end process architecture, and authored requirements documentation</w:t>
+        <w:t>Led the digitization of the Labour and Employment Subsystem (LMAS): analyzed the full citizen life-event service journey from application to result, defined the methodology and end-to-end process architecture, and authored requirements documentation</w:t>
       </w:r>
     </w:p>
     <w:p>
@@ -566,7 +566,7 @@
           <w:color w:val="212529"/>
           <w:sz w:val="18"/>
         </w:rPr>
-        <w:t>Coordinated the integration of 10+ government organizations into the Government Payment Portal (GPP): defined data exchange requirements and integration specifications for each agency</w:t>
+        <w:t>Coordinated the integration of 10+ government organizations into the single-window Government Payment Portal (GPP): defined data exchange requirements and integration specifications for each agency</w:t>
       </w:r>
     </w:p>
     <w:p>

</xml_diff>

<commit_message>
CV v6: added keywords - process architecture, service portfolio, alignment - to match As-Is/To-Be requirement
</commit_message>
<xml_diff>
--- a/Zamir_Jamalov_CV_Innovation_Agency_EN.docx
+++ b/Zamir_Jamalov_CV_Innovation_Agency_EN.docx
@@ -82,7 +82,7 @@
           <w:color w:val="212529"/>
           <w:sz w:val="17"/>
         </w:rPr>
-        <w:t>Business Analyst with 18 years in IT, specializing in government service digitization, multi-agency coordination, and end-to-end process design. Practical experience in service journey analysis, citizen-centered digital service design, and requirements documentation (BRD, FRD, SRS, API Specifications). Strong background in aligning cross-functional teams across government organizations to deliver digital public services.</w:t>
+        <w:t>Business Analyst with 18 years in IT, specializing in government service digitization, multi-agency coordination, and end-to-end process design. Practical experience in service journey analysis, citizen-centered digital service design, and requirements documentation (BRD, FRD, SRS, API Specifications). Strong background in ensuring alignment between process architecture and institutional requirements across government organizations to deliver digital public services.</w:t>
       </w:r>
     </w:p>
     <w:p>
@@ -480,7 +480,7 @@
           <w:color w:val="212529"/>
           <w:sz w:val="18"/>
         </w:rPr>
-        <w:t>Led the digitization of the Labour and Employment Subsystem (LMAS): analyzed the full citizen life-event service journey from application to result, defined the methodology and end-to-end process architecture, and authored requirements documentation</w:t>
+        <w:t>Led the digitization of the Labour and Employment Subsystem (LMAS): analyzed the full citizen life-event service journey from application to result, defined the methodology and end-to-end process architecture, and authored requirements documentation; ensured alignment of new service design with existing service portfolio and institutional structures</w:t>
       </w:r>
     </w:p>
     <w:p>
@@ -580,7 +580,7 @@
           <w:color w:val="212529"/>
           <w:sz w:val="18"/>
         </w:rPr>
-        <w:t>Designed cross-system data exchange middleware between government institutions, enabling automated payment processing at national scale</w:t>
+        <w:t>Designed the process architecture for cross-system data exchange between government institutions, enabling automated payment processing at national scale</w:t>
       </w:r>
     </w:p>
     <w:p>

</xml_diff>

<commit_message>
CV v8: Rewrote summary to lead with government consolidation experience, added bullets to Central Bank (data exchange standards) and State Employment Agency (life-event based design)
</commit_message>
<xml_diff>
--- a/Zamir_Jamalov_CV_Innovation_Agency_EN.docx
+++ b/Zamir_Jamalov_CV_Innovation_Agency_EN.docx
@@ -82,7 +82,7 @@
           <w:color w:val="212529"/>
           <w:sz w:val="17"/>
         </w:rPr>
-        <w:t>Business Analyst with 18 years in IT, specializing in government service digitization, multi-agency coordination, and end-to-end process design. Practical experience in service journey analysis, citizen-centered digital service design, and requirements documentation (BRD, FRD, SRS, API Specifications). Strong background in ensuring alignment between process architecture and institutional requirements across government organizations to deliver digital public services.</w:t>
+        <w:t>Business Analyst with direct experience in government service consolidation: coordinated 10+ agencies into the single-window Government Payment Portal at the Central Bank and led end-to-end service design for the Labour Market Analysis System at the State Employment Agency. Recently strengthened with fintech experience in API design (Swagger/OpenAPI 3.0), Agile delivery, and production-grade documentation (BRD, FRD, SRS, ToR, SDD). Strong background in ensuring alignment between process architecture and institutional requirements across government organizations.</w:t>
       </w:r>
     </w:p>
     <w:p>
@@ -527,6 +527,20 @@
     </w:p>
     <w:p>
       <w:pPr>
+        <w:spacing w:after="30" w:before="0" w:line="250" w:lineRule="exact"/>
+        <w:ind w:left="360" w:hanging="216"/>
+      </w:pPr>
+      <w:r>
+        <w:rPr>
+          <w:rFonts w:ascii="Calibri" w:hAnsi="Calibri"/>
+          <w:color w:val="212529"/>
+          <w:sz w:val="18"/>
+        </w:rPr>
+        <w:t xml:space="preserve">Applied life-event based design approach: organized services around the citizen unemployment journey rather than agency structure, ensuring cross-agency service alignment</w:t>
+      </w:r>
+    </w:p>
+    <w:p>
+      <w:pPr>
         <w:spacing w:after="20" w:before="80" w:line="260" w:lineRule="exact"/>
         <w:jc w:val="left"/>
       </w:pPr>
@@ -581,6 +595,20 @@
           <w:sz w:val="18"/>
         </w:rPr>
         <w:t>Designed the process architecture and interoperability layer for cross-system data exchange between government institutions, enabling automated payment processing at national scale</w:t>
+      </w:r>
+    </w:p>
+    <w:p>
+      <w:pPr>
+        <w:spacing w:after="30" w:before="0" w:line="250" w:lineRule="exact"/>
+        <w:ind w:left="360" w:hanging="216"/>
+      </w:pPr>
+      <w:r>
+        <w:rPr>
+          <w:rFonts w:ascii="Calibri" w:hAnsi="Calibri"/>
+          <w:color w:val="212529"/>
+          <w:sz w:val="18"/>
+        </w:rPr>
+        <w:t xml:space="preserve">Established standardized data exchange specifications and integration standards across agencies with different technical maturity levels</w:t>
       </w:r>
     </w:p>
     <w:p>

</xml_diff>